<commit_message>
Corregir diagramas y PDF del capítulo 7 mejorado
- Simplificar fig1 (arquitectura): layout limpio sin texto encimado
- Simplificar fig2 (flujo de datos): 3 ramas claras sin superposición
- Eliminar sección 7.4.4 (modelo ER) por no ser pertinente
- Renumerar secciones 7.4.5 y 7.4.6
- PDF con fuente por defecto de LaTeX (Computer Modern) via pdflatex
- Corregir caracteres unicode para compatibilidad con pdflatex
</commit_message>
<xml_diff>
--- a/capitulo_7/capitulo_7_improved.docx
+++ b/capitulo_7/capitulo_7_improved.docx
@@ -1956,7 +1956,7 @@
       <w:r>
         <w:drawing>
           <wp:inline>
-            <wp:extent cx="5334000" cy="3988728"/>
+            <wp:extent cx="5334000" cy="3719514"/>
             <wp:effectExtent b="0" l="0" r="0" t="0"/>
             <wp:docPr descr="Arquitectura del sistema de gestión financiera modular" title="" id="1" name="Picture"/>
             <a:graphic>
@@ -1977,7 +1977,7 @@
                   <pic:spPr bwMode="auto">
                     <a:xfrm>
                       <a:off x="0" y="0"/>
-                      <a:ext cx="5334000" cy="3988728"/>
+                      <a:ext cx="5334000" cy="3719514"/>
                     </a:xfrm>
                     <a:prstGeom prst="rect">
                       <a:avLst/>
@@ -2193,7 +2193,7 @@
       <w:r>
         <w:drawing>
           <wp:inline>
-            <wp:extent cx="5334000" cy="6101758"/>
+            <wp:extent cx="5334000" cy="6414815"/>
             <wp:effectExtent b="0" l="0" r="0" t="0"/>
             <wp:docPr descr="Flujo de datos del sistema de gestión financiera" title="" id="1" name="Picture"/>
             <a:graphic>
@@ -2214,7 +2214,7 @@
                   <pic:spPr bwMode="auto">
                     <a:xfrm>
                       <a:off x="0" y="0"/>
-                      <a:ext cx="5334000" cy="6101758"/>
+                      <a:ext cx="5334000" cy="6414815"/>
                     </a:xfrm>
                     <a:prstGeom prst="rect">
                       <a:avLst/>
@@ -2390,533 +2390,11 @@
       <w:pPr>
         <w:pStyle w:val="Heading3"/>
       </w:pPr>
-      <w:bookmarkStart w:id="42" w:name="modelo-de-datos"/>
-      <w:r>
-        <w:t xml:space="preserve">7.4.4 Modelo de datos</w:t>
+      <w:bookmarkStart w:id="42" w:name="implementación-por-fases-y-kpis"/>
+      <w:r>
+        <w:t xml:space="preserve">7.4.4 Implementación por fases y KPIs</w:t>
       </w:r>
       <w:bookmarkEnd w:id="42"/>
-    </w:p>
-    <w:p>
-      <w:pPr>
-        <w:pStyle w:val="FirstParagraph"/>
-      </w:pPr>
-      <w:r>
-        <w:t xml:space="preserve">El siguiente diagrama entidad-relación representa las principales entidades de datos del sistema y sus relaciones. Se trata de un modelo conceptual simplificado cuyo objetivo es ilustrar qué información necesita capturar y relacionar el sistema.</w:t>
-      </w:r>
-    </w:p>
-    <w:p>
-      <w:pPr>
-        <w:pStyle w:val="CaptionedFigure"/>
-      </w:pPr>
-      <w:r>
-        <w:drawing>
-          <wp:inline>
-            <wp:extent cx="5334000" cy="3993368"/>
-            <wp:effectExtent b="0" l="0" r="0" t="0"/>
-            <wp:docPr descr="Modelo entidad-relación del sistema" title="" id="1" name="Picture"/>
-            <a:graphic>
-              <a:graphicData uri="http://schemas.openxmlformats.org/drawingml/2006/picture">
-                <pic:pic>
-                  <pic:nvPicPr>
-                    <pic:cNvPr descr="diagramas/fig3_modelo_er.png" id="0" name="Picture"/>
-                    <pic:cNvPicPr>
-                      <a:picLocks noChangeArrowheads="1" noChangeAspect="1"/>
-                    </pic:cNvPicPr>
-                  </pic:nvPicPr>
-                  <pic:blipFill>
-                    <a:blip r:embed="rId43"/>
-                    <a:stretch>
-                      <a:fillRect/>
-                    </a:stretch>
-                  </pic:blipFill>
-                  <pic:spPr bwMode="auto">
-                    <a:xfrm>
-                      <a:off x="0" y="0"/>
-                      <a:ext cx="5334000" cy="3993368"/>
-                    </a:xfrm>
-                    <a:prstGeom prst="rect">
-                      <a:avLst/>
-                    </a:prstGeom>
-                    <a:noFill/>
-                    <a:ln w="9525">
-                      <a:noFill/>
-                      <a:headEnd/>
-                      <a:tailEnd/>
-                    </a:ln>
-                  </pic:spPr>
-                </pic:pic>
-              </a:graphicData>
-            </a:graphic>
-          </wp:inline>
-        </w:drawing>
-      </w:r>
-    </w:p>
-    <w:p>
-      <w:pPr>
-        <w:pStyle w:val="ImageCaption"/>
-      </w:pPr>
-      <w:r>
-        <w:t xml:space="preserve">Modelo entidad-relación del sistema</w:t>
-      </w:r>
-    </w:p>
-    <w:p>
-      <w:pPr>
-        <w:pStyle w:val="BodyText"/>
-      </w:pPr>
-      <w:r>
-        <w:rPr>
-          <w:i/>
-        </w:rPr>
-        <w:t xml:space="preserve">Figura 3. Modelo entidad-relación simplificado. Las nueve entidades del sistema (Producto, Venta, DetalleVenta, Insumo, Receta, Gasto, CorteCaja, Empleado, Nómina) representan las unidades de información necesarias para integrar la gestión financiera del negocio.</w:t>
-      </w:r>
-    </w:p>
-    <w:p>
-      <w:pPr>
-        <w:pStyle w:val="BodyText"/>
-      </w:pPr>
-      <w:r>
-        <w:t xml:space="preserve">El modelo contempla nueve entidades principales:</w:t>
-      </w:r>
-    </w:p>
-    <w:tbl>
-      <w:tblPr>
-        <w:tblStyle w:val="Table"/>
-        <w:tblW w:type="pct" w:w="5000.0"/>
-        <w:tblLook w:firstRow="1"/>
-      </w:tblPr>
-      <w:tblGrid>
-        <w:gridCol w:w="2640"/>
-        <w:gridCol w:w="2640"/>
-        <w:gridCol w:w="2640"/>
-      </w:tblGrid>
-      <w:tr>
-        <w:trPr>
-          <w:cnfStyle w:firstRow="1"/>
-        </w:trPr>
-        <w:tc>
-          <w:tcPr>
-            <w:tcBorders>
-              <w:bottom w:val="single"/>
-            </w:tcBorders>
-            <w:vAlign w:val="bottom"/>
-          </w:tcPr>
-          <w:p>
-            <w:pPr>
-              <w:pStyle w:val="Compact"/>
-              <w:jc w:val="left"/>
-            </w:pPr>
-            <w:r>
-              <w:t xml:space="preserve">Entidad</w:t>
-            </w:r>
-          </w:p>
-        </w:tc>
-        <w:tc>
-          <w:tcPr>
-            <w:tcBorders>
-              <w:bottom w:val="single"/>
-            </w:tcBorders>
-            <w:vAlign w:val="bottom"/>
-          </w:tcPr>
-          <w:p>
-            <w:pPr>
-              <w:pStyle w:val="Compact"/>
-              <w:jc w:val="left"/>
-            </w:pPr>
-            <w:r>
-              <w:t xml:space="preserve">Descripción</w:t>
-            </w:r>
-          </w:p>
-        </w:tc>
-        <w:tc>
-          <w:tcPr>
-            <w:tcBorders>
-              <w:bottom w:val="single"/>
-            </w:tcBorders>
-            <w:vAlign w:val="bottom"/>
-          </w:tcPr>
-          <w:p>
-            <w:pPr>
-              <w:pStyle w:val="Compact"/>
-              <w:jc w:val="left"/>
-            </w:pPr>
-            <w:r>
-              <w:t xml:space="preserve">Registros estimados</w:t>
-            </w:r>
-          </w:p>
-        </w:tc>
-      </w:tr>
-      <w:tr>
-        <w:tc>
-          <w:p>
-            <w:pPr>
-              <w:pStyle w:val="Compact"/>
-              <w:jc w:val="left"/>
-            </w:pPr>
-            <w:r>
-              <w:rPr>
-                <w:b/>
-              </w:rPr>
-              <w:t xml:space="preserve">Producto</w:t>
-            </w:r>
-          </w:p>
-        </w:tc>
-        <w:tc>
-          <w:p>
-            <w:pPr>
-              <w:pStyle w:val="Compact"/>
-              <w:jc w:val="left"/>
-            </w:pPr>
-            <w:r>
-              <w:t xml:space="preserve">Cada artículo del menú: pizzas, panes, postres, bebidas. Incluye precio de venta y costo unitario calculado a partir de la receta</w:t>
-            </w:r>
-          </w:p>
-        </w:tc>
-        <w:tc>
-          <w:p>
-            <w:pPr>
-              <w:pStyle w:val="Compact"/>
-              <w:jc w:val="left"/>
-            </w:pPr>
-            <w:r>
-              <w:t xml:space="preserve">~30 a 40 productos activos</w:t>
-            </w:r>
-          </w:p>
-        </w:tc>
-      </w:tr>
-      <w:tr>
-        <w:tc>
-          <w:p>
-            <w:pPr>
-              <w:pStyle w:val="Compact"/>
-              <w:jc w:val="left"/>
-            </w:pPr>
-            <w:r>
-              <w:rPr>
-                <w:b/>
-              </w:rPr>
-              <w:t xml:space="preserve">Venta</w:t>
-            </w:r>
-          </w:p>
-        </w:tc>
-        <w:tc>
-          <w:p>
-            <w:pPr>
-              <w:pStyle w:val="Compact"/>
-              <w:jc w:val="left"/>
-            </w:pPr>
-            <w:r>
-              <w:t xml:space="preserve">Cada transacción individual con un cliente. Registra fecha, hora, método de pago y el empleado que la registró</w:t>
-            </w:r>
-          </w:p>
-        </w:tc>
-        <w:tc>
-          <w:p>
-            <w:pPr>
-              <w:pStyle w:val="Compact"/>
-              <w:jc w:val="left"/>
-            </w:pPr>
-            <w:r>
-              <w:t xml:space="preserve">~30 a 60 ventas diarias</w:t>
-            </w:r>
-          </w:p>
-        </w:tc>
-      </w:tr>
-      <w:tr>
-        <w:tc>
-          <w:p>
-            <w:pPr>
-              <w:pStyle w:val="Compact"/>
-              <w:jc w:val="left"/>
-            </w:pPr>
-            <w:r>
-              <w:rPr>
-                <w:b/>
-              </w:rPr>
-              <w:t xml:space="preserve">DetalleVenta</w:t>
-            </w:r>
-          </w:p>
-        </w:tc>
-        <w:tc>
-          <w:p>
-            <w:pPr>
-              <w:pStyle w:val="Compact"/>
-              <w:jc w:val="left"/>
-            </w:pPr>
-            <w:r>
-              <w:t xml:space="preserve">Líneas individuales de cada venta (qué producto, cuántas unidades, a qué precio)</w:t>
-            </w:r>
-          </w:p>
-        </w:tc>
-        <w:tc>
-          <w:p>
-            <w:pPr>
-              <w:pStyle w:val="Compact"/>
-              <w:jc w:val="left"/>
-            </w:pPr>
-            <w:r>
-              <w:t xml:space="preserve">~50 a 100 líneas diarias</w:t>
-            </w:r>
-          </w:p>
-        </w:tc>
-      </w:tr>
-      <w:tr>
-        <w:tc>
-          <w:p>
-            <w:pPr>
-              <w:pStyle w:val="Compact"/>
-              <w:jc w:val="left"/>
-            </w:pPr>
-            <w:r>
-              <w:rPr>
-                <w:b/>
-              </w:rPr>
-              <w:t xml:space="preserve">Insumo</w:t>
-            </w:r>
-          </w:p>
-        </w:tc>
-        <w:tc>
-          <w:p>
-            <w:pPr>
-              <w:pStyle w:val="Compact"/>
-              <w:jc w:val="left"/>
-            </w:pPr>
-            <w:r>
-              <w:t xml:space="preserve">Cada materia prima: harina, queso mozzarella, pepperoni, tomate, levadura, etc.</w:t>
-            </w:r>
-          </w:p>
-        </w:tc>
-        <w:tc>
-          <w:p>
-            <w:pPr>
-              <w:pStyle w:val="Compact"/>
-              <w:jc w:val="left"/>
-            </w:pPr>
-            <w:r>
-              <w:t xml:space="preserve">~50 a 80 insumos</w:t>
-            </w:r>
-          </w:p>
-        </w:tc>
-      </w:tr>
-      <w:tr>
-        <w:tc>
-          <w:p>
-            <w:pPr>
-              <w:pStyle w:val="Compact"/>
-              <w:jc w:val="left"/>
-            </w:pPr>
-            <w:r>
-              <w:rPr>
-                <w:b/>
-              </w:rPr>
-              <w:t xml:space="preserve">Receta (BOM)</w:t>
-            </w:r>
-          </w:p>
-        </w:tc>
-        <w:tc>
-          <w:p>
-            <w:pPr>
-              <w:pStyle w:val="Compact"/>
-              <w:jc w:val="left"/>
-            </w:pPr>
-            <w:r>
-              <w:t xml:space="preserve">Lista de materiales por producto: qué insumos y en qué cantidad se necesitan para una unidad</w:t>
-            </w:r>
-          </w:p>
-        </w:tc>
-        <w:tc>
-          <w:p>
-            <w:pPr>
-              <w:pStyle w:val="Compact"/>
-              <w:jc w:val="left"/>
-            </w:pPr>
-            <w:r>
-              <w:t xml:space="preserve">~150 a 250 relaciones</w:t>
-            </w:r>
-          </w:p>
-        </w:tc>
-      </w:tr>
-      <w:tr>
-        <w:tc>
-          <w:p>
-            <w:pPr>
-              <w:pStyle w:val="Compact"/>
-              <w:jc w:val="left"/>
-            </w:pPr>
-            <w:r>
-              <w:rPr>
-                <w:b/>
-              </w:rPr>
-              <w:t xml:space="preserve">Gasto</w:t>
-            </w:r>
-          </w:p>
-        </w:tc>
-        <w:tc>
-          <w:p>
-            <w:pPr>
-              <w:pStyle w:val="Compact"/>
-              <w:jc w:val="left"/>
-            </w:pPr>
-            <w:r>
-              <w:t xml:space="preserve">Cada erogación que no sea compra de insumos: renta, gas, luz, mantenimiento, publicidad</w:t>
-            </w:r>
-          </w:p>
-        </w:tc>
-        <w:tc>
-          <w:p>
-            <w:pPr>
-              <w:pStyle w:val="Compact"/>
-              <w:jc w:val="left"/>
-            </w:pPr>
-            <w:r>
-              <w:t xml:space="preserve">~30 a 50 gastos mensuales</w:t>
-            </w:r>
-          </w:p>
-        </w:tc>
-      </w:tr>
-      <w:tr>
-        <w:tc>
-          <w:p>
-            <w:pPr>
-              <w:pStyle w:val="Compact"/>
-              <w:jc w:val="left"/>
-            </w:pPr>
-            <w:r>
-              <w:rPr>
-                <w:b/>
-              </w:rPr>
-              <w:t xml:space="preserve">CorteCaja</w:t>
-            </w:r>
-          </w:p>
-        </w:tc>
-        <w:tc>
-          <w:p>
-            <w:pPr>
-              <w:pStyle w:val="Compact"/>
-              <w:jc w:val="left"/>
-            </w:pPr>
-            <w:r>
-              <w:t xml:space="preserve">Registro del cierre diario de caja: ventas, efectivo contado, tarjeta, diferencia</w:t>
-            </w:r>
-          </w:p>
-        </w:tc>
-        <w:tc>
-          <w:p>
-            <w:pPr>
-              <w:pStyle w:val="Compact"/>
-              <w:jc w:val="left"/>
-            </w:pPr>
-            <w:r>
-              <w:t xml:space="preserve">1 por día operativo (~26/mes)</w:t>
-            </w:r>
-          </w:p>
-        </w:tc>
-      </w:tr>
-      <w:tr>
-        <w:tc>
-          <w:p>
-            <w:pPr>
-              <w:pStyle w:val="Compact"/>
-              <w:jc w:val="left"/>
-            </w:pPr>
-            <w:r>
-              <w:rPr>
-                <w:b/>
-              </w:rPr>
-              <w:t xml:space="preserve">Empleado</w:t>
-            </w:r>
-          </w:p>
-        </w:tc>
-        <w:tc>
-          <w:p>
-            <w:pPr>
-              <w:pStyle w:val="Compact"/>
-              <w:jc w:val="left"/>
-            </w:pPr>
-            <w:r>
-              <w:t xml:space="preserve">Datos de cada miembro del equipo: Martín, Mariana, Luis Ángel, Sofía</w:t>
-            </w:r>
-          </w:p>
-        </w:tc>
-        <w:tc>
-          <w:p>
-            <w:pPr>
-              <w:pStyle w:val="Compact"/>
-              <w:jc w:val="left"/>
-            </w:pPr>
-            <w:r>
-              <w:t xml:space="preserve">4 registros activos</w:t>
-            </w:r>
-          </w:p>
-        </w:tc>
-      </w:tr>
-      <w:tr>
-        <w:tc>
-          <w:p>
-            <w:pPr>
-              <w:pStyle w:val="Compact"/>
-              <w:jc w:val="left"/>
-            </w:pPr>
-            <w:r>
-              <w:rPr>
-                <w:b/>
-              </w:rPr>
-              <w:t xml:space="preserve">Nómina</w:t>
-            </w:r>
-          </w:p>
-        </w:tc>
-        <w:tc>
-          <w:p>
-            <w:pPr>
-              <w:pStyle w:val="Compact"/>
-              <w:jc w:val="left"/>
-            </w:pPr>
-            <w:r>
-              <w:t xml:space="preserve">Registro de cada pago: salario base, deducciones, neto pagado, fecha y método</w:t>
-            </w:r>
-          </w:p>
-        </w:tc>
-        <w:tc>
-          <w:p>
-            <w:pPr>
-              <w:pStyle w:val="Compact"/>
-              <w:jc w:val="left"/>
-            </w:pPr>
-            <w:r>
-              <w:t xml:space="preserve">~8 registros mensuales</w:t>
-            </w:r>
-          </w:p>
-        </w:tc>
-      </w:tr>
-    </w:tbl>
-    <w:p>
-      <w:pPr>
-        <w:pStyle w:val="BodyText"/>
-      </w:pPr>
-      <w:r>
-        <w:t xml:space="preserve">La pieza clave del modelo es la entidad</w:t>
-      </w:r>
-      <w:r>
-        <w:t xml:space="preserve"> </w:t>
-      </w:r>
-      <w:r>
-        <w:rPr>
-          <w:b/>
-        </w:rPr>
-        <w:t xml:space="preserve">Receta</w:t>
-      </w:r>
-      <w:r>
-        <w:t xml:space="preserve">, que vincula cada producto del menú con los insumos que lo componen. Esta relación es la que permite que una venta registrada en el POS genere automáticamente el descuento de inventario y el cálculo de costo de materia prima, resolviendo la desconexión entre ventas y costos que el diagnóstico identificó como una de las brechas más críticas.</w:t>
-      </w:r>
-    </w:p>
-    <w:p>
-      <w:pPr>
-        <w:pStyle w:val="Heading3"/>
-      </w:pPr>
-      <w:bookmarkStart w:id="44" w:name="implementación-por-fases-y-kpis"/>
-      <w:r>
-        <w:t xml:space="preserve">7.4.5 Implementación por fases y KPIs</w:t>
-      </w:r>
-      <w:bookmarkEnd w:id="44"/>
     </w:p>
     <w:p>
       <w:pPr>
@@ -3340,7 +2818,7 @@
               <w:jc w:val="left"/>
             </w:pPr>
             <w:r>
-              <w:t xml:space="preserve">(Ventas − Costo MP) ÷ Ventas × 100</w:t>
+              <w:t xml:space="preserve">(Ventas - Costo MP) ÷ Ventas × 100</w:t>
             </w:r>
           </w:p>
         </w:tc>
@@ -3530,7 +3008,7 @@
               <w:jc w:val="left"/>
             </w:pPr>
             <w:r>
-              <w:t xml:space="preserve">(Efectivo contado − Efectivo esperado) ÷ Efectivo esperado × 100</w:t>
+              <w:t xml:space="preserve">(Efectivo contado - Efectivo esperado) ÷ Efectivo esperado × 100</w:t>
             </w:r>
           </w:p>
         </w:tc>
@@ -3660,11 +3138,11 @@
       <w:pPr>
         <w:pStyle w:val="Heading3"/>
       </w:pPr>
-      <w:bookmarkStart w:id="45" w:name="Xb0b2ed704842d1bdc087efb5f7b7d93b3975be7"/>
-      <w:r>
-        <w:t xml:space="preserve">7.4.6 Impacto esperado en el corto y largo plazo</w:t>
-      </w:r>
-      <w:bookmarkEnd w:id="45"/>
+      <w:bookmarkStart w:id="43" w:name="Xb0b2ed704842d1bdc087efb5f7b7d93b3975be7"/>
+      <w:r>
+        <w:t xml:space="preserve">7.4.5 Impacto esperado en el corto y largo plazo</w:t>
+      </w:r>
+      <w:bookmarkEnd w:id="43"/>
     </w:p>
     <w:p>
       <w:pPr>
@@ -3732,7 +3210,7 @@
         <w:rPr>
           <w:rStyle w:val="FootnoteReference"/>
         </w:rPr>
-        <w:footnoteReference w:id="46"/>
+        <w:footnoteReference w:id="44"/>
       </w:r>
     </w:p>
     <w:p>
@@ -3815,7 +3293,7 @@
         <w:rPr>
           <w:rStyle w:val="FootnoteReference"/>
         </w:rPr>
-        <w:footnoteReference w:id="47"/>
+        <w:footnoteReference w:id="45"/>
       </w:r>
     </w:p>
     <w:p>
@@ -3963,7 +3441,7 @@
       </w:r>
     </w:p>
   </w:footnote>
-  <w:footnote w:id="46">
+  <w:footnote w:id="44">
     <w:p>
       <w:pPr>
         <w:pStyle w:val="FootnoteText"/>
@@ -3994,7 +3472,7 @@
       </w:r>
     </w:p>
   </w:footnote>
-  <w:footnote w:id="47">
+  <w:footnote w:id="45">
     <w:p>
       <w:pPr>
         <w:pStyle w:val="FootnoteText"/>

</xml_diff>